<commit_message>
Overview: ;refuse, 33 templates
</commit_message>
<xml_diff>
--- a/docs/Watchlog - Overview.docx
+++ b/docs/Watchlog - Overview.docx
@@ -210,7 +210,7 @@
     <w:p>
       <w:pPr/>
       <w:r>
-        <w:t xml:space="preserve">There are 36 templates so far. Every code starts with a semicolon so it never goes off in the middle of normal typing, and the entry appears as soon as the code is typed.</w:t>
+        <w:t xml:space="preserve">There are 33 templates so far. Every code starts with a semicolon so it never goes off in the middle of normal typing, and the entry appears as soon as the code is typed.</w:t>
       </w:r>
     </w:p>
     <w:tbl>
@@ -407,37 +407,16 @@
               <w:rPr>
                 <w:rStyle w:val="CodeChar"/>
               </w:rPr>
-              <w:t xml:space="preserve">;noid</w:t>
-            </w:r>
-            <w:r>
-              <w:t xml:space="preserve"> · </w:t>
-            </w:r>
-            <w:r>
-              <w:rPr>
-                <w:rStyle w:val="CodeChar"/>
-              </w:rPr>
-              <w:t xml:space="preserve">;insuf</w:t>
-            </w:r>
-            <w:r>
-              <w:t xml:space="preserve"> · </w:t>
-            </w:r>
-            <w:r>
-              <w:rPr>
-                <w:rStyle w:val="CodeChar"/>
-              </w:rPr>
-              <w:t xml:space="preserve">;intox</w:t>
-            </w:r>
-            <w:r>
-              <w:t xml:space="preserve"> · </w:t>
-            </w:r>
-            <w:r>
-              <w:rPr>
-                <w:rStyle w:val="CodeChar"/>
-              </w:rPr>
-              <w:t xml:space="preserve">;expired</w:t>
-            </w:r>
-            <w:r>
-              <w:t xml:space="preserve"> refused entry · </w:t>
+              <w:t xml:space="preserve">;</w:t>
+            </w:r>
+            <w:r>
+              <w:rPr>
+                <w:rStyle w:val="CodeChar"/>
+              </w:rPr>
+              <w:t xml:space="preserve">refuse</w:t>
+            </w:r>
+            <w:r>
+              <w:t xml:space="preserve"> refused entry (one or several patrons) · </w:t>
             </w:r>
             <w:r>
               <w:rPr>

</xml_diff>

<commit_message>
v3.22.1: light is the default again with the blue accent; Dark look switch in the tray menu and Customize
Co-Authored-By: Claude Sonnet 5.5 <noreply@anthropic.com>
Claude-Session: https://claude.ai/code/session_01WkiUyeSJwmrxzEc1reVpsf
</commit_message>
<xml_diff>
--- a/docs/Watchlog - Overview.docx
+++ b/docs/Watchlog - Overview.docx
@@ -231,7 +231,7 @@
         <w:pStyle w:val="FirstParagraph"/>
       </w:pPr>
       <w:r>
-        <w:t>It’s a small Windows program. It’s written in AutoHotkey, a free automation tool that has been around for years, and comes as a single Watchlog.exe with everything built in, so nothing else needs installing. It sits by the clock as a small teal icon and starts with Windows. I’ve been building and testing it myself since October 13. Version 3.0 was the first one set up for the team, and it’s on 3.22.0 now.</w:t>
+        <w:t>It’s a small Windows program. It’s written in AutoHotkey, a free automation tool that has been around for years, and comes as a single Watchlog.exe with everything built in, so nothing else needs installing. It sits by the clock as a small teal icon and starts with Windows. I’ve been building and testing it myself since October 13. Version 3.0 was the first one set up for the team, and it’s on 3.22.1 now.</w:t>
       </w:r>
     </w:p>
     <w:bookmarkStart w:id="21" w:name="log-entries"/>
@@ -1282,7 +1282,7 @@
         <w:pStyle w:val="FirstParagraph"/>
       </w:pPr>
       <w:r>
-        <w:t>Clicking the Watchlog icon (or Ctrl+Alt+M) opens a home window with a button for every feature, grouped as Logs, Logins and Set up. Each button shows its shortcut, so new operators learn the keys as they go. Three panels across the top show this shift’s logs, logins and typing saved. A strip along the bottom shows the version, whether the templates are current, whether Alert Grid and iTrak are taught on this PC and the time saved this shift. Right-clicking the icon gives the same things as a menu with small pictures, and the less-used items are tucked into Alert Grid, iTrak, Windows and Advanced sub-menus. Every window uses a dark look with a blue accent, which Customize can turn off.</w:t>
+        <w:t>Clicking the Watchlog icon (or Ctrl+Alt+M) opens a home window with a button for every feature, grouped as Logs, Logins and Set up. Each button shows its shortcut, so new operators learn the keys as they go. Three panels across the top show this shift’s logs, logins and typing saved. A strip along the bottom shows the version, whether the templates are current, whether Alert Grid and iTrak are taught on this PC and the time saved this shift. Right-clicking the icon gives the same things as a menu with small pictures, and the less-used items are tucked into Alert Grid, iTrak, Windows and Advanced sub-menus. The windows use a blue accent, and there’s a dark look too, switched on from the tray menu or Customize.</w:t>
       </w:r>
     </w:p>
     <w:p>
@@ -3769,7 +3769,7 @@
         <w:pStyle w:val="FirstParagraph"/>
       </w:pPr>
       <w:r>
-        <w:t>Version 3.22.0 is built and I’ve been using it on my own shifts. If it’s approved, this is how I’d see it going:</w:t>
+        <w:t>Version 3.22.1 is built and I’ve been using it on my own shifts. If it’s approved, this is how I’d see it going:</w:t>
       </w:r>
     </w:p>
     <w:p>

</xml_diff>

<commit_message>
v3.22.2: Settings tabs taller so the Logins beep tick box is not cut off
Co-Authored-By: Claude Sonnet 5.5 <noreply@anthropic.com>
Claude-Session: https://claude.ai/code/session_01WkiUyeSJwmrxzEc1reVpsf
</commit_message>
<xml_diff>
--- a/docs/Watchlog - Overview.docx
+++ b/docs/Watchlog - Overview.docx
@@ -231,7 +231,7 @@
         <w:pStyle w:val="FirstParagraph"/>
       </w:pPr>
       <w:r>
-        <w:t>It’s a small Windows program. It’s written in AutoHotkey, a free automation tool that has been around for years, and comes as a single Watchlog.exe with everything built in, so nothing else needs installing. It sits by the clock as a small teal icon and starts with Windows. I’ve been building and testing it myself since October 13. Version 3.0 was the first one set up for the team, and it’s on 3.22.1 now.</w:t>
+        <w:t>It’s a small Windows program. It’s written in AutoHotkey, a free automation tool that has been around for years, and comes as a single Watchlog.exe with everything built in, so nothing else needs installing. It sits by the clock as a small teal icon and starts with Windows. I’ve been building and testing it myself since October 13. Version 3.0 was the first one set up for the team, and it’s on 3.22.2 now.</w:t>
       </w:r>
     </w:p>
     <w:bookmarkStart w:id="21" w:name="log-entries"/>
@@ -3769,7 +3769,7 @@
         <w:pStyle w:val="FirstParagraph"/>
       </w:pPr>
       <w:r>
-        <w:t>Version 3.22.1 is built and I’ve been using it on my own shifts. If it’s approved, this is how I’d see it going:</w:t>
+        <w:t>Version 3.22.2 is built and I’ve been using it on my own shifts. If it’s approved, this is how I’d see it going:</w:t>
       </w:r>
     </w:p>
     <w:p>

</xml_diff>